<commit_message>
Ningún salto de página entre un título y lo que le sigue, aunque sea otro título
- tcee.sty: un título que sigue directamente a otro no pide sitio
  (\Needspace forzaba el salto entre los dos) y cada \color de los
  títulos va seguido de \nobreak (el nodo de color dejaba un corte legal).
- verificar-tema.py: error si un título es lo último de una página.
- CRITERIOS.md: regla de Víctor (17/10/2026).
- Temas 3A08, 3A09, 3A11, 3A12 y 3A21 reconstruidos (3A11 y 3A21 tenían
  un título al pie).

Co-Authored-By: Claude Opus 5.5 <noreply@anthropic.com>
Claude-Session: https://claude.ai/code/session_01PWJgAjs4PN1Rvp3aLA4tqT
</commit_message>
<xml_diff>
--- a/oposicion/temario/tercer-ejercicio/3A11.docx
+++ b/oposicion/temario/tercer-ejercicio/3A11.docx
@@ -47244,7 +47244,7 @@
         <w:pStyle w:val="Bibliography"/>
       </w:pPr>
       <w:r>
-        <w:t xml:space="preserve">Ekelund, Robert B. y Robert F. Hébert. 2013.</w:t>
+        <w:t xml:space="preserve">Ekelund, Robert B. y Robert F. Hébert. 2014.</w:t>
       </w:r>
       <w:r>
         <w:t xml:space="preserve"> </w:t>
@@ -49611,7 +49611,7 @@
           <w:rPr>
             <w:rStyle w:val="Hyperlink"/>
           </w:rPr>
-          <w:t xml:space="preserve">2013</w:t>
+          <w:t xml:space="preserve">2014</w:t>
         </w:r>
       </w:hyperlink>
       <w:r>

</xml_diff>